<commit_message>
docs(Rapport mal med utfyly fremside metadata.pdf): Added report with filled out metadata in pdf form
</commit_message>
<xml_diff>
--- a/Rapport.docx
+++ b/Rapport.docx
@@ -21,9 +21,9 @@
         <w:tblLook w:val="0000" w:firstRow="0" w:lastRow="0" w:firstColumn="0" w:lastColumn="0" w:noHBand="0" w:noVBand="0"/>
       </w:tblPr>
       <w:tblGrid>
-        <w:gridCol w:w="993"/>
-        <w:gridCol w:w="1559"/>
-        <w:gridCol w:w="4599"/>
+        <w:gridCol w:w="1481"/>
+        <w:gridCol w:w="1275"/>
+        <w:gridCol w:w="4395"/>
         <w:gridCol w:w="1921"/>
       </w:tblGrid>
       <w:tr>
@@ -53,6 +53,11 @@
               <w:t>:</w:t>
             </w:r>
           </w:p>
+          <w:p>
+            <w:pPr>
+              <w:pStyle w:val="Tabellovsk"/>
+            </w:pPr>
+          </w:p>
         </w:tc>
       </w:tr>
       <w:tr>
@@ -70,8 +75,55 @@
             </w:tcBorders>
           </w:tcPr>
           <w:p>
-            <w:bookmarkStart w:id="0" w:name="Forfatter2"/>
-            <w:bookmarkEnd w:id="0"/>
+            <w:pPr>
+              <w:rPr>
+                <w:b/>
+                <w:bCs/>
+              </w:rPr>
+            </w:pPr>
+            <w:r>
+              <w:rPr>
+                <w:b/>
+                <w:bCs/>
+              </w:rPr>
+              <w:t>Ottersbo</w:t>
+            </w:r>
+            <w:r>
+              <w:rPr>
+                <w:b/>
+                <w:bCs/>
+              </w:rPr>
+              <w:t xml:space="preserve">, </w:t>
+            </w:r>
+            <w:r>
+              <w:rPr>
+                <w:b/>
+                <w:bCs/>
+              </w:rPr>
+              <w:t>Elias Alexander Wiklund (10072)</w:t>
+            </w:r>
+          </w:p>
+          <w:p>
+            <w:pPr>
+              <w:rPr>
+                <w:b/>
+                <w:bCs/>
+              </w:rPr>
+            </w:pPr>
+            <w:r>
+              <w:rPr>
+                <w:b/>
+                <w:bCs/>
+              </w:rPr>
+              <w:t>Evensen</w:t>
+            </w:r>
+            <w:r>
+              <w:rPr>
+                <w:b/>
+                <w:bCs/>
+              </w:rPr>
+              <w:t>, Sigurd ()</w:t>
+            </w:r>
           </w:p>
         </w:tc>
       </w:tr>
@@ -81,14 +133,14 @@
         </w:trPr>
         <w:tc>
           <w:tcPr>
-            <w:tcW w:w="993" w:type="dxa"/>
+            <w:tcW w:w="1481" w:type="dxa"/>
           </w:tcPr>
           <w:p>
             <w:pPr>
               <w:pStyle w:val="Tabellovsk"/>
             </w:pPr>
-            <w:bookmarkStart w:id="1" w:name="Veileder"/>
-            <w:bookmarkEnd w:id="1"/>
+            <w:bookmarkStart w:id="0" w:name="Veileder"/>
+            <w:bookmarkEnd w:id="0"/>
             <w:r>
               <w:t>Dato:</w:t>
             </w:r>
@@ -96,7 +148,7 @@
         </w:tc>
         <w:tc>
           <w:tcPr>
-            <w:tcW w:w="1559" w:type="dxa"/>
+            <w:tcW w:w="1275" w:type="dxa"/>
           </w:tcPr>
           <w:p>
             <w:pPr>
@@ -109,7 +161,7 @@
         </w:tc>
         <w:tc>
           <w:tcPr>
-            <w:tcW w:w="4599" w:type="dxa"/>
+            <w:tcW w:w="4395" w:type="dxa"/>
           </w:tcPr>
           <w:p>
             <w:pPr>
@@ -140,35 +192,45 @@
         </w:trPr>
         <w:tc>
           <w:tcPr>
-            <w:tcW w:w="993" w:type="dxa"/>
+            <w:tcW w:w="1481" w:type="dxa"/>
           </w:tcPr>
           <w:p>
-            <w:bookmarkStart w:id="2" w:name="Oppgavenr2"/>
-            <w:bookmarkEnd w:id="2"/>
+            <w:bookmarkStart w:id="1" w:name="Oppgavenr2"/>
+            <w:bookmarkEnd w:id="1"/>
+            <w:r>
+              <w:t>26/5 - 2026</w:t>
+            </w:r>
           </w:p>
         </w:tc>
         <w:tc>
           <w:tcPr>
-            <w:tcW w:w="1559" w:type="dxa"/>
+            <w:tcW w:w="1275" w:type="dxa"/>
           </w:tcPr>
-          <w:p/>
+          <w:p>
+            <w:r>
+              <w:t>IDATT2003</w:t>
+            </w:r>
+          </w:p>
         </w:tc>
         <w:tc>
           <w:tcPr>
-            <w:tcW w:w="4599" w:type="dxa"/>
+            <w:tcW w:w="4395" w:type="dxa"/>
           </w:tcPr>
           <w:p>
             <w:pPr>
               <w:jc w:val="center"/>
             </w:pPr>
-            <w:bookmarkStart w:id="3" w:name="Versjonsnr"/>
-            <w:bookmarkStart w:id="4" w:name="Studie"/>
+            <w:bookmarkStart w:id="2" w:name="Versjonsnr"/>
+            <w:bookmarkStart w:id="3" w:name="Studie"/>
+            <w:bookmarkEnd w:id="2"/>
             <w:bookmarkEnd w:id="3"/>
-            <w:bookmarkEnd w:id="4"/>
+            <w:r>
+              <w:t>BIDATA - TRONDHEIM</w:t>
+            </w:r>
           </w:p>
         </w:tc>
-        <w:bookmarkStart w:id="5" w:name="Sider"/>
-        <w:bookmarkEnd w:id="5"/>
+        <w:bookmarkStart w:id="4" w:name="Sider"/>
+        <w:bookmarkEnd w:id="4"/>
         <w:tc>
           <w:tcPr>
             <w:tcW w:w="1921" w:type="dxa"/>
@@ -198,10 +260,10 @@
             <w:r>
               <w:t xml:space="preserve"> / </w:t>
             </w:r>
-            <w:bookmarkStart w:id="6" w:name="Bilag"/>
-            <w:bookmarkStart w:id="7" w:name="Bibiloteknr"/>
+            <w:bookmarkStart w:id="5" w:name="Bilag"/>
+            <w:bookmarkStart w:id="6" w:name="Bibiloteknr"/>
+            <w:bookmarkEnd w:id="5"/>
             <w:bookmarkEnd w:id="6"/>
-            <w:bookmarkEnd w:id="7"/>
           </w:p>
         </w:tc>
       </w:tr>
@@ -261,65 +323,41 @@
             </w:tcBorders>
           </w:tcPr>
           <w:p/>
-          <w:p/>
-        </w:tc>
-      </w:tr>
-    </w:tbl>
-    <w:p/>
-    <w:p/>
-    <w:tbl>
-      <w:tblPr>
-        <w:tblW w:w="0" w:type="auto"/>
-        <w:tblInd w:w="70" w:type="dxa"/>
-        <w:tblLayout w:type="fixed"/>
-        <w:tblCellMar>
-          <w:left w:w="70" w:type="dxa"/>
-          <w:right w:w="70" w:type="dxa"/>
-        </w:tblCellMar>
-        <w:tblLook w:val="0000" w:firstRow="0" w:lastRow="0" w:firstColumn="0" w:lastColumn="0" w:noHBand="0" w:noVBand="0"/>
-      </w:tblPr>
-      <w:tblGrid>
-        <w:gridCol w:w="9072"/>
-      </w:tblGrid>
-      <w:tr>
-        <w:trPr>
-          <w:trHeight w:val="320"/>
-        </w:trPr>
-        <w:tc>
-          <w:tcPr>
-            <w:tcW w:w="9072" w:type="dxa"/>
-            <w:tcBorders>
-              <w:top w:val="single" w:sz="6" w:space="0" w:color="auto"/>
-              <w:left w:val="single" w:sz="6" w:space="0" w:color="auto"/>
-              <w:right w:val="single" w:sz="6" w:space="0" w:color="auto"/>
-            </w:tcBorders>
-          </w:tcPr>
           <w:p>
             <w:pPr>
-              <w:pStyle w:val="Tabellovsk"/>
+              <w:numPr>
+                <w:ilvl w:val="0"/>
+                <w:numId w:val="6"/>
+              </w:numPr>
             </w:pPr>
-            <w:r>
-              <w:t>Tittel :</w:t>
-            </w:r>
+            <w:hyperlink r:id="rId11" w:tgtFrame="_blank" w:history="1">
+              <w:r>
+                <w:rPr>
+                  <w:rStyle w:val="Hyperkobling"/>
+                  <w:color w:val="auto"/>
+                  <w:u w:val="none"/>
+                </w:rPr>
+                <w:t>Atle Olsø</w:t>
+              </w:r>
+            </w:hyperlink>
           </w:p>
-        </w:tc>
-      </w:tr>
-      <w:tr>
-        <w:trPr>
-          <w:trHeight w:val="900"/>
-        </w:trPr>
-        <w:tc>
-          <w:tcPr>
-            <w:tcW w:w="9072" w:type="dxa"/>
-            <w:tcBorders>
-              <w:left w:val="single" w:sz="6" w:space="0" w:color="auto"/>
-              <w:bottom w:val="single" w:sz="6" w:space="0" w:color="auto"/>
-              <w:right w:val="single" w:sz="6" w:space="0" w:color="auto"/>
-            </w:tcBorders>
-          </w:tcPr>
           <w:p>
-            <w:bookmarkStart w:id="8" w:name="Tittel2"/>
-            <w:bookmarkEnd w:id="8"/>
+            <w:pPr>
+              <w:numPr>
+                <w:ilvl w:val="0"/>
+                <w:numId w:val="6"/>
+              </w:numPr>
+            </w:pPr>
+            <w:hyperlink r:id="rId12" w:tgtFrame="_blank" w:history="1">
+              <w:r>
+                <w:rPr>
+                  <w:rStyle w:val="Hyperkobling"/>
+                  <w:color w:val="auto"/>
+                  <w:u w:val="none"/>
+                </w:rPr>
+                <w:t>Majid Rouhani</w:t>
+              </w:r>
+            </w:hyperlink>
           </w:p>
           <w:p/>
         </w:tc>
@@ -359,6 +397,70 @@
               <w:pStyle w:val="Tabellovsk"/>
             </w:pPr>
             <w:r>
+              <w:t>Tittel :</w:t>
+            </w:r>
+          </w:p>
+        </w:tc>
+      </w:tr>
+      <w:tr>
+        <w:trPr>
+          <w:trHeight w:val="900"/>
+        </w:trPr>
+        <w:tc>
+          <w:tcPr>
+            <w:tcW w:w="9072" w:type="dxa"/>
+            <w:tcBorders>
+              <w:left w:val="single" w:sz="6" w:space="0" w:color="auto"/>
+              <w:bottom w:val="single" w:sz="6" w:space="0" w:color="auto"/>
+              <w:right w:val="single" w:sz="6" w:space="0" w:color="auto"/>
+            </w:tcBorders>
+          </w:tcPr>
+          <w:p>
+            <w:bookmarkStart w:id="7" w:name="Tittel2"/>
+            <w:bookmarkEnd w:id="7"/>
+          </w:p>
+          <w:p>
+            <w:r>
+              <w:t>IDATT2003 Programmering 2 – Mappevurdering 2026 Rapport</w:t>
+            </w:r>
+          </w:p>
+        </w:tc>
+      </w:tr>
+    </w:tbl>
+    <w:p/>
+    <w:p/>
+    <w:tbl>
+      <w:tblPr>
+        <w:tblW w:w="0" w:type="auto"/>
+        <w:tblInd w:w="70" w:type="dxa"/>
+        <w:tblLayout w:type="fixed"/>
+        <w:tblCellMar>
+          <w:left w:w="70" w:type="dxa"/>
+          <w:right w:w="70" w:type="dxa"/>
+        </w:tblCellMar>
+        <w:tblLook w:val="0000" w:firstRow="0" w:lastRow="0" w:firstColumn="0" w:lastColumn="0" w:noHBand="0" w:noVBand="0"/>
+      </w:tblPr>
+      <w:tblGrid>
+        <w:gridCol w:w="9072"/>
+      </w:tblGrid>
+      <w:tr>
+        <w:trPr>
+          <w:trHeight w:val="320"/>
+        </w:trPr>
+        <w:tc>
+          <w:tcPr>
+            <w:tcW w:w="9072" w:type="dxa"/>
+            <w:tcBorders>
+              <w:top w:val="single" w:sz="6" w:space="0" w:color="auto"/>
+              <w:left w:val="single" w:sz="6" w:space="0" w:color="auto"/>
+              <w:right w:val="single" w:sz="6" w:space="0" w:color="auto"/>
+            </w:tcBorders>
+          </w:tcPr>
+          <w:p>
+            <w:pPr>
+              <w:pStyle w:val="Tabellovsk"/>
+            </w:pPr>
+            <w:r>
               <w:t>Sammendrag:</w:t>
             </w:r>
           </w:p>
@@ -378,8 +480,8 @@
             </w:tcBorders>
           </w:tcPr>
           <w:p>
-            <w:bookmarkStart w:id="9" w:name="Sammendrag"/>
-            <w:bookmarkEnd w:id="9"/>
+            <w:bookmarkStart w:id="8" w:name="Sammendrag"/>
+            <w:bookmarkEnd w:id="8"/>
           </w:p>
           <w:p>
             <w:pPr>
@@ -609,6 +711,9 @@
             <w:pPr>
               <w:pStyle w:val="Brdtekst"/>
             </w:pPr>
+            <w:r>
+              <w:t>X</w:t>
+            </w:r>
           </w:p>
         </w:tc>
         <w:tc>
@@ -1056,8 +1161,8 @@
                 <w:top w:val="none" w:sz="0" w:space="0" w:color="auto"/>
               </w:pBdr>
             </w:pPr>
-            <w:bookmarkStart w:id="10" w:name="OLE_LINK7"/>
-            <w:bookmarkStart w:id="11" w:name="OLE_LINK8"/>
+            <w:bookmarkStart w:id="9" w:name="OLE_LINK7"/>
+            <w:bookmarkStart w:id="10" w:name="OLE_LINK8"/>
           </w:p>
         </w:tc>
         <w:tc>
@@ -1116,8 +1221,8 @@
         </w:tc>
       </w:tr>
     </w:tbl>
+    <w:bookmarkEnd w:id="9"/>
     <w:bookmarkEnd w:id="10"/>
-    <w:bookmarkEnd w:id="11"/>
     <w:p>
       <w:pPr>
         <w:pStyle w:val="KI-Brdtekst"/>
@@ -1296,8 +1401,8 @@
                 <w:top w:val="none" w:sz="0" w:space="0" w:color="auto"/>
               </w:pBdr>
             </w:pPr>
-            <w:bookmarkStart w:id="12" w:name="OLE_LINK11"/>
-            <w:bookmarkStart w:id="13" w:name="OLE_LINK12"/>
+            <w:bookmarkStart w:id="11" w:name="OLE_LINK11"/>
+            <w:bookmarkStart w:id="12" w:name="OLE_LINK12"/>
           </w:p>
         </w:tc>
         <w:tc>
@@ -1362,8 +1467,8 @@
         </w:tc>
       </w:tr>
     </w:tbl>
+    <w:bookmarkEnd w:id="11"/>
     <w:bookmarkEnd w:id="12"/>
-    <w:bookmarkEnd w:id="13"/>
     <w:p>
       <w:pPr>
         <w:pStyle w:val="KI-Brdtekst"/>
@@ -1436,13 +1541,13 @@
           </w:tcPr>
           <w:p>
             <w:pPr>
-              <w:pStyle w:val="KI-Overskrift2"/>
-              <w:pBdr>
-                <w:top w:val="none" w:sz="0" w:space="0" w:color="auto"/>
-              </w:pBdr>
+              <w:pStyle w:val="Ingenmellomrom"/>
             </w:pPr>
-            <w:bookmarkStart w:id="14" w:name="OLE_LINK15"/>
-            <w:bookmarkStart w:id="15" w:name="OLE_LINK16"/>
+            <w:bookmarkStart w:id="13" w:name="OLE_LINK15"/>
+            <w:bookmarkStart w:id="14" w:name="OLE_LINK16"/>
+            <w:r>
+              <w:t>X</w:t>
+            </w:r>
           </w:p>
         </w:tc>
         <w:tc>
@@ -1483,8 +1588,8 @@
           </w:p>
         </w:tc>
       </w:tr>
+      <w:bookmarkEnd w:id="13"/>
       <w:bookmarkEnd w:id="14"/>
-      <w:bookmarkEnd w:id="15"/>
     </w:tbl>
     <w:p>
       <w:pPr>
@@ -1512,6 +1617,9 @@
             <w:pPr>
               <w:pStyle w:val="KI-Brdtekst"/>
             </w:pPr>
+            <w:r>
+              <w:t>Se kapittel 3.3.</w:t>
+            </w:r>
           </w:p>
         </w:tc>
       </w:tr>
@@ -1568,6 +1676,10 @@
                 <w:top w:val="none" w:sz="0" w:space="0" w:color="auto"/>
               </w:pBdr>
             </w:pPr>
+            <w:r>
+              <w:lastRenderedPageBreak/>
+              <w:t>X</w:t>
+            </w:r>
           </w:p>
         </w:tc>
         <w:tc>
@@ -1618,6 +1730,37 @@
           <w:sz w:val="20"/>
         </w:rPr>
       </w:pPr>
+      <w:r>
+        <w:rPr>
+          <w:sz w:val="20"/>
+        </w:rPr>
+        <w:tab/>
+      </w:r>
+      <w:r>
+        <w:rPr>
+          <w:sz w:val="20"/>
+        </w:rPr>
+        <w:tab/>
+      </w:r>
+      <w:r>
+        <w:rPr>
+          <w:sz w:val="20"/>
+        </w:rPr>
+        <w:tab/>
+      </w:r>
+      <w:r>
+        <w:rPr>
+          <w:sz w:val="20"/>
+        </w:rPr>
+        <w:tab/>
+      </w:r>
+      <w:r>
+        <w:rPr>
+          <w:sz w:val="20"/>
+        </w:rPr>
+        <w:tab/>
+        <w:t>(KOMMER SENERE)</w:t>
+      </w:r>
     </w:p>
     <w:p>
       <w:pPr>
@@ -4062,10 +4205,10 @@
       <w:pPr>
         <w:pStyle w:val="Brdtekst"/>
         <w:sectPr>
-          <w:headerReference w:type="default" r:id="rId11"/>
-          <w:footerReference w:type="default" r:id="rId12"/>
-          <w:headerReference w:type="first" r:id="rId13"/>
-          <w:footerReference w:type="first" r:id="rId14"/>
+          <w:headerReference w:type="default" r:id="rId13"/>
+          <w:footerReference w:type="default" r:id="rId14"/>
+          <w:headerReference w:type="first" r:id="rId15"/>
+          <w:footerReference w:type="first" r:id="rId16"/>
           <w:pgSz w:w="11906" w:h="16838" w:code="9"/>
           <w:pgMar w:top="1418" w:right="1418" w:bottom="1418" w:left="1418" w:header="709" w:footer="454" w:gutter="0"/>
           <w:cols w:space="708"/>
@@ -4077,74 +4220,74 @@
       <w:pPr>
         <w:pStyle w:val="Overskrift1"/>
       </w:pPr>
-      <w:bookmarkStart w:id="16" w:name="_Ref125375270"/>
-      <w:bookmarkStart w:id="17" w:name="_Ref125375282"/>
-      <w:bookmarkStart w:id="18" w:name="_Toc136784282"/>
-      <w:bookmarkStart w:id="19" w:name="_Toc158625712"/>
+      <w:bookmarkStart w:id="15" w:name="_Ref125375270"/>
+      <w:bookmarkStart w:id="16" w:name="_Ref125375282"/>
+      <w:bookmarkStart w:id="17" w:name="_Toc136784282"/>
+      <w:bookmarkStart w:id="18" w:name="_Toc158625712"/>
       <w:r>
         <w:lastRenderedPageBreak/>
         <w:t>Introduksjon</w:t>
       </w:r>
+      <w:bookmarkEnd w:id="15"/>
       <w:bookmarkEnd w:id="16"/>
       <w:bookmarkEnd w:id="17"/>
       <w:bookmarkEnd w:id="18"/>
+    </w:p>
+    <w:p>
+      <w:pPr>
+        <w:pStyle w:val="Overskrift2"/>
+      </w:pPr>
+      <w:bookmarkStart w:id="19" w:name="_Toc136784283"/>
+      <w:bookmarkStart w:id="20" w:name="_Toc158625713"/>
+      <w:r>
+        <w:t>Bakgrunn</w:t>
+      </w:r>
       <w:bookmarkEnd w:id="19"/>
+      <w:bookmarkEnd w:id="20"/>
+    </w:p>
+    <w:p>
+      <w:pPr>
+        <w:pStyle w:val="Comment"/>
+      </w:pPr>
+      <w:r>
+        <w:t>[</w:t>
+      </w:r>
+      <w:r>
+        <w:t>Dette er første kapitlet i den faglige rapporten.  Det bør behandle bakgrunnen for oppgaven,</w:t>
+      </w:r>
+      <w:r>
+        <w:t xml:space="preserve"> eventuell</w:t>
+      </w:r>
+      <w:r>
+        <w:t xml:space="preserve"> oppdragsgiver, </w:t>
+      </w:r>
+      <w:r>
+        <w:t xml:space="preserve">oppsummering av </w:t>
+      </w:r>
+      <w:r>
+        <w:t>problemstillingen og/eller oppgaven som skal løses</w:t>
+      </w:r>
+      <w:r>
+        <w:t>.</w:t>
+      </w:r>
+      <w:r>
+        <w:t>]</w:t>
+      </w:r>
     </w:p>
     <w:p>
       <w:pPr>
         <w:pStyle w:val="Overskrift2"/>
       </w:pPr>
-      <w:bookmarkStart w:id="20" w:name="_Toc136784283"/>
-      <w:bookmarkStart w:id="21" w:name="_Toc158625713"/>
-      <w:r>
-        <w:t>Bakgrunn</w:t>
-      </w:r>
-      <w:bookmarkEnd w:id="20"/>
+      <w:bookmarkStart w:id="21" w:name="_Ref125975861"/>
+      <w:bookmarkStart w:id="22" w:name="_Toc136784287"/>
+      <w:bookmarkStart w:id="23" w:name="_Toc158625714"/>
+      <w:bookmarkStart w:id="24" w:name="_Toc136784284"/>
+      <w:r>
+        <w:t>Kravspesifikasjon</w:t>
+      </w:r>
       <w:bookmarkEnd w:id="21"/>
-    </w:p>
-    <w:p>
-      <w:pPr>
-        <w:pStyle w:val="Comment"/>
-      </w:pPr>
-      <w:r>
-        <w:t>[</w:t>
-      </w:r>
-      <w:r>
-        <w:t>Dette er første kapitlet i den faglige rapporten.  Det bør behandle bakgrunnen for oppgaven,</w:t>
-      </w:r>
-      <w:r>
-        <w:t xml:space="preserve"> eventuell</w:t>
-      </w:r>
-      <w:r>
-        <w:t xml:space="preserve"> oppdragsgiver, </w:t>
-      </w:r>
-      <w:r>
-        <w:t xml:space="preserve">oppsummering av </w:t>
-      </w:r>
-      <w:r>
-        <w:t>problemstillingen og/eller oppgaven som skal løses</w:t>
-      </w:r>
-      <w:r>
-        <w:t>.</w:t>
-      </w:r>
-      <w:r>
-        <w:t>]</w:t>
-      </w:r>
-    </w:p>
-    <w:p>
-      <w:pPr>
-        <w:pStyle w:val="Overskrift2"/>
-      </w:pPr>
-      <w:bookmarkStart w:id="22" w:name="_Ref125975861"/>
-      <w:bookmarkStart w:id="23" w:name="_Toc136784287"/>
-      <w:bookmarkStart w:id="24" w:name="_Toc158625714"/>
-      <w:bookmarkStart w:id="25" w:name="_Toc136784284"/>
-      <w:r>
-        <w:t>Kravspesifikasjon</w:t>
-      </w:r>
       <w:bookmarkEnd w:id="22"/>
       <w:bookmarkEnd w:id="23"/>
-      <w:bookmarkEnd w:id="24"/>
     </w:p>
     <w:p>
       <w:pPr>
@@ -4307,7 +4450,7 @@
                     </pic:cNvPicPr>
                   </pic:nvPicPr>
                   <pic:blipFill>
-                    <a:blip r:embed="rId15">
+                    <a:blip r:embed="rId17">
                       <a:extLst>
                         <a:ext uri="{28A0092B-C50C-407E-A947-70E740481C1C}">
                           <a14:useLocalDpi xmlns:a14="http://schemas.microsoft.com/office/drawing/2010/main" val="0"/>
@@ -4346,7 +4489,7 @@
       <w:pPr>
         <w:pStyle w:val="Bildetekst"/>
       </w:pPr>
-      <w:bookmarkStart w:id="26" w:name="_Toc126231951"/>
+      <w:bookmarkStart w:id="25" w:name="_Toc126231951"/>
       <w:r>
         <w:t xml:space="preserve">Figur </w:t>
       </w:r>
@@ -4371,23 +4514,23 @@
       <w:r>
         <w:t xml:space="preserve"> Use Case diagram</w:t>
       </w:r>
+      <w:bookmarkEnd w:id="25"/>
+    </w:p>
+    <w:p>
+      <w:pPr>
+        <w:pStyle w:val="Figure"/>
+      </w:pPr>
+    </w:p>
+    <w:p>
+      <w:pPr>
+        <w:pStyle w:val="Overskrift2"/>
+      </w:pPr>
+      <w:bookmarkStart w:id="26" w:name="_Toc158625715"/>
+      <w:r>
+        <w:t>Avgrensninger</w:t>
+      </w:r>
+      <w:bookmarkEnd w:id="24"/>
       <w:bookmarkEnd w:id="26"/>
-    </w:p>
-    <w:p>
-      <w:pPr>
-        <w:pStyle w:val="Figure"/>
-      </w:pPr>
-    </w:p>
-    <w:p>
-      <w:pPr>
-        <w:pStyle w:val="Overskrift2"/>
-      </w:pPr>
-      <w:bookmarkStart w:id="27" w:name="_Toc158625715"/>
-      <w:r>
-        <w:t>Avgrensninger</w:t>
-      </w:r>
-      <w:bookmarkEnd w:id="25"/>
-      <w:bookmarkEnd w:id="27"/>
     </w:p>
     <w:p>
       <w:pPr>
@@ -4420,13 +4563,13 @@
       <w:pPr>
         <w:pStyle w:val="Overskrift2"/>
       </w:pPr>
-      <w:bookmarkStart w:id="28" w:name="_Toc136784285"/>
-      <w:bookmarkStart w:id="29" w:name="_Toc158625716"/>
+      <w:bookmarkStart w:id="27" w:name="_Toc136784285"/>
+      <w:bookmarkStart w:id="28" w:name="_Toc158625716"/>
       <w:r>
         <w:t>Begreper/Ordliste</w:t>
       </w:r>
+      <w:bookmarkEnd w:id="27"/>
       <w:bookmarkEnd w:id="28"/>
-      <w:bookmarkEnd w:id="29"/>
     </w:p>
     <w:p>
       <w:pPr>
@@ -4793,7 +4936,7 @@
       <w:pPr>
         <w:pStyle w:val="Bildetekst"/>
       </w:pPr>
-      <w:bookmarkStart w:id="30" w:name="_Toc126231737"/>
+      <w:bookmarkStart w:id="29" w:name="_Toc126231737"/>
       <w:r>
         <w:t xml:space="preserve">Tabell </w:t>
       </w:r>
@@ -4818,22 +4961,22 @@
       <w:r>
         <w:t xml:space="preserve"> Begreper og ordliste</w:t>
       </w:r>
+      <w:bookmarkEnd w:id="29"/>
+    </w:p>
+    <w:p>
+      <w:pPr>
+        <w:pStyle w:val="Overskrift1"/>
+      </w:pPr>
+      <w:bookmarkStart w:id="30" w:name="_Toc136784286"/>
+      <w:bookmarkStart w:id="31" w:name="_Toc158625717"/>
+      <w:bookmarkStart w:id="32" w:name="_Ref125374860"/>
+      <w:bookmarkStart w:id="33" w:name="_Ref125374869"/>
+      <w:bookmarkStart w:id="34" w:name="_Ref125375184"/>
+      <w:r>
+        <w:t>Teori</w:t>
+      </w:r>
       <w:bookmarkEnd w:id="30"/>
-    </w:p>
-    <w:p>
-      <w:pPr>
-        <w:pStyle w:val="Overskrift1"/>
-      </w:pPr>
-      <w:bookmarkStart w:id="31" w:name="_Toc136784286"/>
-      <w:bookmarkStart w:id="32" w:name="_Toc158625717"/>
-      <w:bookmarkStart w:id="33" w:name="_Ref125374860"/>
-      <w:bookmarkStart w:id="34" w:name="_Ref125374869"/>
-      <w:bookmarkStart w:id="35" w:name="_Ref125375184"/>
-      <w:r>
-        <w:t>Teori</w:t>
-      </w:r>
       <w:bookmarkEnd w:id="31"/>
-      <w:bookmarkEnd w:id="32"/>
     </w:p>
     <w:p>
       <w:pPr>
@@ -5002,12 +5145,12 @@
       <w:pPr>
         <w:pStyle w:val="Overskrift1"/>
       </w:pPr>
-      <w:bookmarkStart w:id="36" w:name="_Toc158625718"/>
-      <w:bookmarkStart w:id="37" w:name="_Toc136784289"/>
+      <w:bookmarkStart w:id="35" w:name="_Toc158625718"/>
+      <w:bookmarkStart w:id="36" w:name="_Toc136784289"/>
       <w:r>
         <w:t>Metode</w:t>
       </w:r>
-      <w:bookmarkEnd w:id="36"/>
+      <w:bookmarkEnd w:id="35"/>
     </w:p>
     <w:p>
       <w:pPr>
@@ -5031,12 +5174,12 @@
       <w:pPr>
         <w:pStyle w:val="Overskrift2"/>
       </w:pPr>
-      <w:bookmarkStart w:id="38" w:name="_Toc158625719"/>
+      <w:bookmarkStart w:id="37" w:name="_Toc158625719"/>
       <w:r>
         <w:t>Utviklingsprosess</w:t>
       </w:r>
+      <w:bookmarkEnd w:id="36"/>
       <w:bookmarkEnd w:id="37"/>
-      <w:bookmarkEnd w:id="38"/>
     </w:p>
     <w:p>
       <w:pPr>
@@ -5130,11 +5273,11 @@
       <w:pPr>
         <w:pStyle w:val="Overskrift2"/>
       </w:pPr>
-      <w:bookmarkStart w:id="39" w:name="_Toc158625720"/>
+      <w:bookmarkStart w:id="38" w:name="_Toc158625720"/>
       <w:r>
         <w:t>Verktøy</w:t>
       </w:r>
-      <w:bookmarkEnd w:id="39"/>
+      <w:bookmarkEnd w:id="38"/>
     </w:p>
     <w:p>
       <w:pPr>
@@ -5170,14 +5313,14 @@
       <w:pPr>
         <w:pStyle w:val="Overskrift2"/>
       </w:pPr>
-      <w:bookmarkStart w:id="40" w:name="_Toc158625721"/>
+      <w:bookmarkStart w:id="39" w:name="_Toc158625721"/>
       <w:r>
         <w:t xml:space="preserve">Bruk av </w:t>
       </w:r>
       <w:r>
         <w:t>KI verktøy</w:t>
       </w:r>
-      <w:bookmarkEnd w:id="40"/>
+      <w:bookmarkEnd w:id="39"/>
     </w:p>
     <w:p>
       <w:pPr>
@@ -5244,43 +5387,43 @@
       <w:pPr>
         <w:pStyle w:val="Overskrift1"/>
       </w:pPr>
-      <w:bookmarkStart w:id="41" w:name="_Toc158625722"/>
-      <w:bookmarkStart w:id="42" w:name="_Toc136784288"/>
-      <w:bookmarkStart w:id="43" w:name="_Toc136784290"/>
+      <w:bookmarkStart w:id="40" w:name="_Toc158625722"/>
+      <w:bookmarkStart w:id="41" w:name="_Toc136784288"/>
+      <w:bookmarkStart w:id="42" w:name="_Toc136784290"/>
       <w:r>
         <w:t>Resultat</w:t>
       </w:r>
+      <w:bookmarkEnd w:id="40"/>
+    </w:p>
+    <w:p>
+      <w:pPr>
+        <w:pStyle w:val="Overskrift2"/>
+      </w:pPr>
+      <w:bookmarkStart w:id="43" w:name="_Toc158625723"/>
+      <w:r>
+        <w:t>Teknisk Design</w:t>
+      </w:r>
       <w:bookmarkEnd w:id="41"/>
+      <w:bookmarkEnd w:id="43"/>
+    </w:p>
+    <w:p>
+      <w:pPr>
+        <w:pStyle w:val="Comment"/>
+      </w:pPr>
+      <w:r>
+        <w:t>[Kapittelet om teknisk design beskriver det store bildet av valgt løsning. For et programvareutviklingsprosjekt vil dette vanligvis inneholde systemarkitekturen (klient-server, sky, databaser, tjenester, desktop-applikasjon osv.); både hvordan det ble løst, og, enda viktigere, hvorfor denne arkitektur ble valgt]</w:t>
+      </w:r>
     </w:p>
     <w:p>
       <w:pPr>
         <w:pStyle w:val="Overskrift2"/>
       </w:pPr>
-      <w:bookmarkStart w:id="44" w:name="_Toc158625723"/>
-      <w:r>
-        <w:t>Teknisk Design</w:t>
+      <w:bookmarkStart w:id="44" w:name="_Toc158625724"/>
+      <w:r>
+        <w:t>Implementasjon</w:t>
       </w:r>
       <w:bookmarkEnd w:id="42"/>
       <w:bookmarkEnd w:id="44"/>
-    </w:p>
-    <w:p>
-      <w:pPr>
-        <w:pStyle w:val="Comment"/>
-      </w:pPr>
-      <w:r>
-        <w:t>[Kapittelet om teknisk design beskriver det store bildet av valgt løsning. For et programvareutviklingsprosjekt vil dette vanligvis inneholde systemarkitekturen (klient-server, sky, databaser, tjenester, desktop-applikasjon osv.); både hvordan det ble løst, og, enda viktigere, hvorfor denne arkitektur ble valgt]</w:t>
-      </w:r>
-    </w:p>
-    <w:p>
-      <w:pPr>
-        <w:pStyle w:val="Overskrift2"/>
-      </w:pPr>
-      <w:bookmarkStart w:id="45" w:name="_Toc158625724"/>
-      <w:r>
-        <w:t>Implementasjon</w:t>
-      </w:r>
-      <w:bookmarkEnd w:id="43"/>
-      <w:bookmarkEnd w:id="45"/>
     </w:p>
     <w:p>
       <w:pPr>
@@ -5445,7 +5588,7 @@
                     </pic:cNvPicPr>
                   </pic:nvPicPr>
                   <pic:blipFill>
-                    <a:blip r:embed="rId16">
+                    <a:blip r:embed="rId18">
                       <a:extLst>
                         <a:ext uri="{28A0092B-C50C-407E-A947-70E740481C1C}">
                           <a14:useLocalDpi xmlns:a14="http://schemas.microsoft.com/office/drawing/2010/main" val="0"/>
@@ -5484,7 +5627,7 @@
       <w:pPr>
         <w:pStyle w:val="Bildetekst"/>
       </w:pPr>
-      <w:bookmarkStart w:id="46" w:name="_Toc126231952"/>
+      <w:bookmarkStart w:id="45" w:name="_Toc126231952"/>
       <w:r>
         <w:t xml:space="preserve">Figur </w:t>
       </w:r>
@@ -5509,19 +5652,19 @@
       <w:r>
         <w:t xml:space="preserve"> Klassediagram som viser...</w:t>
       </w:r>
+      <w:bookmarkEnd w:id="45"/>
+    </w:p>
+    <w:p>
+      <w:pPr>
+        <w:pStyle w:val="Overskrift2"/>
+      </w:pPr>
+      <w:bookmarkStart w:id="46" w:name="_Toc136784291"/>
+      <w:bookmarkStart w:id="47" w:name="_Toc158625725"/>
+      <w:r>
+        <w:t>Testing</w:t>
+      </w:r>
       <w:bookmarkEnd w:id="46"/>
-    </w:p>
-    <w:p>
-      <w:pPr>
-        <w:pStyle w:val="Overskrift2"/>
-      </w:pPr>
-      <w:bookmarkStart w:id="47" w:name="_Toc136784291"/>
-      <w:bookmarkStart w:id="48" w:name="_Toc158625725"/>
-      <w:r>
-        <w:t>Testing</w:t>
-      </w:r>
       <w:bookmarkEnd w:id="47"/>
-      <w:bookmarkEnd w:id="48"/>
     </w:p>
     <w:p>
       <w:pPr>
@@ -5566,13 +5709,13 @@
       <w:pPr>
         <w:pStyle w:val="Overskrift2"/>
       </w:pPr>
-      <w:bookmarkStart w:id="49" w:name="_Toc136784292"/>
-      <w:bookmarkStart w:id="50" w:name="_Toc158625726"/>
+      <w:bookmarkStart w:id="48" w:name="_Toc136784292"/>
+      <w:bookmarkStart w:id="49" w:name="_Toc158625726"/>
       <w:r>
         <w:t>Utrulling til sluttbruker (deployment)</w:t>
       </w:r>
+      <w:bookmarkEnd w:id="48"/>
       <w:bookmarkEnd w:id="49"/>
-      <w:bookmarkEnd w:id="50"/>
     </w:p>
     <w:p>
       <w:pPr>
@@ -5592,26 +5735,26 @@
       <w:pPr>
         <w:pStyle w:val="Overskrift1"/>
       </w:pPr>
-      <w:bookmarkStart w:id="51" w:name="_Toc136784293"/>
-      <w:bookmarkStart w:id="52" w:name="_Toc158625727"/>
+      <w:bookmarkStart w:id="50" w:name="_Toc136784293"/>
+      <w:bookmarkStart w:id="51" w:name="_Toc158625727"/>
+      <w:bookmarkEnd w:id="32"/>
       <w:bookmarkEnd w:id="33"/>
       <w:bookmarkEnd w:id="34"/>
-      <w:bookmarkEnd w:id="35"/>
       <w:r>
         <w:t>Drøfting</w:t>
       </w:r>
+      <w:bookmarkEnd w:id="50"/>
       <w:bookmarkEnd w:id="51"/>
+    </w:p>
+    <w:p>
+      <w:pPr>
+        <w:pStyle w:val="Overskrift2"/>
+      </w:pPr>
+      <w:bookmarkStart w:id="52" w:name="_Toc158625728"/>
+      <w:r>
+        <w:t>Drøfting av løsning/design</w:t>
+      </w:r>
       <w:bookmarkEnd w:id="52"/>
-    </w:p>
-    <w:p>
-      <w:pPr>
-        <w:pStyle w:val="Overskrift2"/>
-      </w:pPr>
-      <w:bookmarkStart w:id="53" w:name="_Toc158625728"/>
-      <w:r>
-        <w:t>Drøfting av løsning/design</w:t>
-      </w:r>
-      <w:bookmarkEnd w:id="53"/>
     </w:p>
     <w:p>
       <w:pPr>
@@ -5737,10 +5880,28 @@
       <w:pPr>
         <w:pStyle w:val="Overskrift2"/>
       </w:pPr>
-      <w:bookmarkStart w:id="54" w:name="_Toc158625729"/>
+      <w:bookmarkStart w:id="53" w:name="_Toc158625729"/>
       <w:r>
         <w:t>Drøfting av prosess</w:t>
       </w:r>
+      <w:bookmarkEnd w:id="53"/>
+    </w:p>
+    <w:p>
+      <w:pPr>
+        <w:pStyle w:val="Comment"/>
+      </w:pPr>
+      <w:r>
+        <w:t>[Fulgte dere prosessen som dere planla (og beskrev under kapittelet «Metode»)? Var det lurt, eller ikke? Hva fungerte bra hva fungerte mindre bra? Hva ville du/dere ha gjort annerledes neste gang?]</w:t>
+      </w:r>
+    </w:p>
+    <w:p>
+      <w:pPr>
+        <w:pStyle w:val="Overskrift2"/>
+      </w:pPr>
+      <w:bookmarkStart w:id="54" w:name="_Toc158625730"/>
+      <w:r>
+        <w:t>Drøfting av bruken av KI-verktøy</w:t>
+      </w:r>
       <w:bookmarkEnd w:id="54"/>
     </w:p>
     <w:p>
@@ -5748,52 +5909,34 @@
         <w:pStyle w:val="Comment"/>
       </w:pPr>
       <w:r>
-        <w:t>[Fulgte dere prosessen som dere planla (og beskrev under kapittelet «Metode»)? Var det lurt, eller ikke? Hva fungerte bra hva fungerte mindre bra? Hva ville du/dere ha gjort annerledes neste gang?]</w:t>
-      </w:r>
-    </w:p>
-    <w:p>
-      <w:pPr>
-        <w:pStyle w:val="Overskrift2"/>
-      </w:pPr>
-      <w:bookmarkStart w:id="55" w:name="_Toc158625730"/>
-      <w:r>
-        <w:t>Drøfting av bruken av KI-verktøy</w:t>
+        <w:t>[Dersom du/dere benyttet KI-verktøy i denne oppgaven, drøft kort erfaringene dine/deres. Hva var KI-verktøyene nyttige for å løse? Hvilke svakheter oppdaget du/dere?</w:t>
+      </w:r>
+    </w:p>
+    <w:p>
+      <w:pPr>
+        <w:pStyle w:val="Comment"/>
+      </w:pPr>
+      <w:r>
+        <w:t>Har du/dere ikke benyttet KI-verktøy dropper du dette kapittelet.]</w:t>
+      </w:r>
+    </w:p>
+    <w:p>
+      <w:pPr>
+        <w:pStyle w:val="Overskrift1"/>
+      </w:pPr>
+      <w:bookmarkStart w:id="55" w:name="_Toc136784294"/>
+      <w:bookmarkStart w:id="56" w:name="_Toc158625731"/>
+      <w:r>
+        <w:t>Konklusjon</w:t>
+      </w:r>
+      <w:r>
+        <w:t xml:space="preserve"> - </w:t>
       </w:r>
       <w:bookmarkEnd w:id="55"/>
-    </w:p>
-    <w:p>
-      <w:pPr>
-        <w:pStyle w:val="Comment"/>
-      </w:pPr>
-      <w:r>
-        <w:t>[Dersom du/dere benyttet KI-verktøy i denne oppgaven, drøft kort erfaringene dine/deres. Hva var KI-verktøyene nyttige for å løse? Hvilke svakheter oppdaget du/dere?</w:t>
-      </w:r>
-    </w:p>
-    <w:p>
-      <w:pPr>
-        <w:pStyle w:val="Comment"/>
-      </w:pPr>
-      <w:r>
-        <w:t>Har du/dere ikke benyttet KI-verktøy dropper du dette kapittelet.]</w:t>
-      </w:r>
-    </w:p>
-    <w:p>
-      <w:pPr>
-        <w:pStyle w:val="Overskrift1"/>
-      </w:pPr>
-      <w:bookmarkStart w:id="56" w:name="_Toc136784294"/>
-      <w:bookmarkStart w:id="57" w:name="_Toc158625731"/>
-      <w:r>
-        <w:t>Konklusjon</w:t>
-      </w:r>
-      <w:r>
-        <w:t xml:space="preserve"> - </w:t>
+      <w:r>
+        <w:t>erfaring</w:t>
       </w:r>
       <w:bookmarkEnd w:id="56"/>
-      <w:r>
-        <w:t>erfaring</w:t>
-      </w:r>
-      <w:bookmarkEnd w:id="57"/>
     </w:p>
     <w:p>
       <w:pPr>
@@ -5951,7 +6094,7 @@
       <w:r>
         <w:t xml:space="preserve">Her er en god guide til hvordan oppgi referanser og hvordan referere til de (benyttes av IEEE): </w:t>
       </w:r>
-      <w:hyperlink r:id="rId17" w:history="1">
+      <w:hyperlink r:id="rId19" w:history="1">
         <w:r>
           <w:rPr>
             <w:rStyle w:val="Hyperkobling"/>
@@ -6022,11 +6165,11 @@
       <w:pPr>
         <w:pStyle w:val="OverskriftReferanserogVedlegg"/>
       </w:pPr>
-      <w:bookmarkStart w:id="58" w:name="_Toc136784296"/>
+      <w:bookmarkStart w:id="57" w:name="_Toc136784296"/>
       <w:r>
         <w:t>VEDLEGG</w:t>
       </w:r>
-      <w:bookmarkEnd w:id="58"/>
+      <w:bookmarkEnd w:id="57"/>
     </w:p>
     <w:p>
       <w:pPr>
@@ -6066,7 +6209,7 @@
       </w:r>
     </w:p>
     <w:sectPr>
-      <w:footerReference w:type="default" r:id="rId18"/>
+      <w:footerReference w:type="default" r:id="rId20"/>
       <w:pgSz w:w="11906" w:h="16838" w:code="9"/>
       <w:pgMar w:top="1418" w:right="1418" w:bottom="1418" w:left="1418" w:header="709" w:footer="454" w:gutter="0"/>
       <w:pgNumType w:start="1"/>
@@ -6887,6 +7030,155 @@
     </w:lvl>
   </w:abstractNum>
   <w:abstractNum w:abstractNumId="3" w15:restartNumberingAfterBreak="0">
+    <w:nsid w:val="3B8405F8"/>
+    <w:multiLevelType w:val="multilevel"/>
+    <w:tmpl w:val="51A811D8"/>
+    <w:lvl w:ilvl="0">
+      <w:start w:val="1"/>
+      <w:numFmt w:val="bullet"/>
+      <w:lvlText w:val=""/>
+      <w:lvlJc w:val="left"/>
+      <w:pPr>
+        <w:tabs>
+          <w:tab w:val="num" w:pos="720"/>
+        </w:tabs>
+        <w:ind w:left="720" w:hanging="360"/>
+      </w:pPr>
+      <w:rPr>
+        <w:rFonts w:ascii="Symbol" w:hAnsi="Symbol" w:hint="default"/>
+        <w:sz w:val="20"/>
+      </w:rPr>
+    </w:lvl>
+    <w:lvl w:ilvl="1" w:tentative="1">
+      <w:start w:val="1"/>
+      <w:numFmt w:val="bullet"/>
+      <w:lvlText w:val=""/>
+      <w:lvlJc w:val="left"/>
+      <w:pPr>
+        <w:tabs>
+          <w:tab w:val="num" w:pos="1440"/>
+        </w:tabs>
+        <w:ind w:left="1440" w:hanging="360"/>
+      </w:pPr>
+      <w:rPr>
+        <w:rFonts w:ascii="Symbol" w:hAnsi="Symbol" w:hint="default"/>
+        <w:sz w:val="20"/>
+      </w:rPr>
+    </w:lvl>
+    <w:lvl w:ilvl="2" w:tentative="1">
+      <w:start w:val="1"/>
+      <w:numFmt w:val="bullet"/>
+      <w:lvlText w:val=""/>
+      <w:lvlJc w:val="left"/>
+      <w:pPr>
+        <w:tabs>
+          <w:tab w:val="num" w:pos="2160"/>
+        </w:tabs>
+        <w:ind w:left="2160" w:hanging="360"/>
+      </w:pPr>
+      <w:rPr>
+        <w:rFonts w:ascii="Symbol" w:hAnsi="Symbol" w:hint="default"/>
+        <w:sz w:val="20"/>
+      </w:rPr>
+    </w:lvl>
+    <w:lvl w:ilvl="3" w:tentative="1">
+      <w:start w:val="1"/>
+      <w:numFmt w:val="bullet"/>
+      <w:lvlText w:val=""/>
+      <w:lvlJc w:val="left"/>
+      <w:pPr>
+        <w:tabs>
+          <w:tab w:val="num" w:pos="2880"/>
+        </w:tabs>
+        <w:ind w:left="2880" w:hanging="360"/>
+      </w:pPr>
+      <w:rPr>
+        <w:rFonts w:ascii="Symbol" w:hAnsi="Symbol" w:hint="default"/>
+        <w:sz w:val="20"/>
+      </w:rPr>
+    </w:lvl>
+    <w:lvl w:ilvl="4" w:tentative="1">
+      <w:start w:val="1"/>
+      <w:numFmt w:val="bullet"/>
+      <w:lvlText w:val=""/>
+      <w:lvlJc w:val="left"/>
+      <w:pPr>
+        <w:tabs>
+          <w:tab w:val="num" w:pos="3600"/>
+        </w:tabs>
+        <w:ind w:left="3600" w:hanging="360"/>
+      </w:pPr>
+      <w:rPr>
+        <w:rFonts w:ascii="Symbol" w:hAnsi="Symbol" w:hint="default"/>
+        <w:sz w:val="20"/>
+      </w:rPr>
+    </w:lvl>
+    <w:lvl w:ilvl="5" w:tentative="1">
+      <w:start w:val="1"/>
+      <w:numFmt w:val="bullet"/>
+      <w:lvlText w:val=""/>
+      <w:lvlJc w:val="left"/>
+      <w:pPr>
+        <w:tabs>
+          <w:tab w:val="num" w:pos="4320"/>
+        </w:tabs>
+        <w:ind w:left="4320" w:hanging="360"/>
+      </w:pPr>
+      <w:rPr>
+        <w:rFonts w:ascii="Symbol" w:hAnsi="Symbol" w:hint="default"/>
+        <w:sz w:val="20"/>
+      </w:rPr>
+    </w:lvl>
+    <w:lvl w:ilvl="6" w:tentative="1">
+      <w:start w:val="1"/>
+      <w:numFmt w:val="bullet"/>
+      <w:lvlText w:val=""/>
+      <w:lvlJc w:val="left"/>
+      <w:pPr>
+        <w:tabs>
+          <w:tab w:val="num" w:pos="5040"/>
+        </w:tabs>
+        <w:ind w:left="5040" w:hanging="360"/>
+      </w:pPr>
+      <w:rPr>
+        <w:rFonts w:ascii="Symbol" w:hAnsi="Symbol" w:hint="default"/>
+        <w:sz w:val="20"/>
+      </w:rPr>
+    </w:lvl>
+    <w:lvl w:ilvl="7" w:tentative="1">
+      <w:start w:val="1"/>
+      <w:numFmt w:val="bullet"/>
+      <w:lvlText w:val=""/>
+      <w:lvlJc w:val="left"/>
+      <w:pPr>
+        <w:tabs>
+          <w:tab w:val="num" w:pos="5760"/>
+        </w:tabs>
+        <w:ind w:left="5760" w:hanging="360"/>
+      </w:pPr>
+      <w:rPr>
+        <w:rFonts w:ascii="Symbol" w:hAnsi="Symbol" w:hint="default"/>
+        <w:sz w:val="20"/>
+      </w:rPr>
+    </w:lvl>
+    <w:lvl w:ilvl="8" w:tentative="1">
+      <w:start w:val="1"/>
+      <w:numFmt w:val="bullet"/>
+      <w:lvlText w:val=""/>
+      <w:lvlJc w:val="left"/>
+      <w:pPr>
+        <w:tabs>
+          <w:tab w:val="num" w:pos="6480"/>
+        </w:tabs>
+        <w:ind w:left="6480" w:hanging="360"/>
+      </w:pPr>
+      <w:rPr>
+        <w:rFonts w:ascii="Symbol" w:hAnsi="Symbol" w:hint="default"/>
+        <w:sz w:val="20"/>
+      </w:rPr>
+    </w:lvl>
+  </w:abstractNum>
+  <w:abstractNum w:abstractNumId="4" w15:restartNumberingAfterBreak="0">
     <w:nsid w:val="54660CF4"/>
     <w:multiLevelType w:val="multilevel"/>
     <w:tmpl w:val="AA6A0E18"/>
@@ -7008,7 +7300,7 @@
       </w:pPr>
     </w:lvl>
   </w:abstractNum>
-  <w:abstractNum w:abstractNumId="4" w15:restartNumberingAfterBreak="0">
+  <w:abstractNum w:abstractNumId="5" w15:restartNumberingAfterBreak="0">
     <w:nsid w:val="67AC0B07"/>
     <w:multiLevelType w:val="multilevel"/>
     <w:tmpl w:val="AA6A0E18"/>
@@ -7126,7 +7418,7 @@
     <w:abstractNumId w:val="0"/>
   </w:num>
   <w:num w:numId="2" w16cid:durableId="1794907862">
-    <w:abstractNumId w:val="3"/>
+    <w:abstractNumId w:val="4"/>
   </w:num>
   <w:num w:numId="3" w16cid:durableId="109514294">
     <w:abstractNumId w:val="1"/>
@@ -7135,7 +7427,10 @@
     <w:abstractNumId w:val="2"/>
   </w:num>
   <w:num w:numId="5" w16cid:durableId="1227498313">
-    <w:abstractNumId w:val="4"/>
+    <w:abstractNumId w:val="5"/>
+  </w:num>
+  <w:num w:numId="6" w16cid:durableId="1832256400">
+    <w:abstractNumId w:val="3"/>
   </w:num>
   <w:numIdMacAtCleanup w:val="4"/>
 </w:numbering>
@@ -7729,7 +8024,6 @@
   <w:style w:type="character" w:default="1" w:styleId="Standardskriftforavsnitt">
     <w:name w:val="Default Paragraph Font"/>
     <w:uiPriority w:val="1"/>
-    <w:semiHidden/>
     <w:unhideWhenUsed/>
   </w:style>
   <w:style w:type="table" w:default="1" w:styleId="Vanligtabell">
@@ -8264,6 +8558,16 @@
       </w:numPr>
     </w:pPr>
   </w:style>
+  <w:style w:type="paragraph" w:styleId="Ingenmellomrom">
+    <w:name w:val="No Spacing"/>
+    <w:uiPriority w:val="1"/>
+    <w:qFormat/>
+    <w:rsid w:val="00BF0AED"/>
+    <w:rPr>
+      <w:rFonts w:ascii="Verdana" w:hAnsi="Verdana"/>
+      <w:lang w:val="nb-NO" w:eastAsia="nb-NO"/>
+    </w:rPr>
+  </w:style>
 </w:styles>
 </file>
 
@@ -8588,16 +8892,15 @@
 </file>
 
 <file path=customXml/item1.xml><?xml version="1.0" encoding="utf-8"?>
-<b:Sources xmlns:b="http://schemas.openxmlformats.org/officeDocument/2006/bibliography" xmlns="http://schemas.openxmlformats.org/officeDocument/2006/bibliography" SelectedStyle="/APASixthEditionOfficeOnline.xsl" StyleName="APA" Version="6"/>
+<?mso-contentType ?>
+<FormTemplates xmlns="http://schemas.microsoft.com/sharepoint/v3/contenttype/forms">
+  <Display>DocumentLibraryForm</Display>
+  <Edit>DocumentLibraryForm</Edit>
+  <New>DocumentLibraryForm</New>
+</FormTemplates>
 </file>
 
 <file path=customXml/item2.xml><?xml version="1.0" encoding="utf-8"?>
-<p:properties xmlns:p="http://schemas.microsoft.com/office/2006/metadata/properties" xmlns:xsi="http://www.w3.org/2001/XMLSchema-instance" xmlns:pc="http://schemas.microsoft.com/office/infopath/2007/PartnerControls">
-  <documentManagement/>
-</p:properties>
-</file>
-
-<file path=customXml/item3.xml><?xml version="1.0" encoding="utf-8"?>
 <ct:contentTypeSchema xmlns:ct="http://schemas.microsoft.com/office/2006/metadata/contentType" xmlns:ma="http://schemas.microsoft.com/office/2006/metadata/properties/metaAttributes" ct:_="" ma:_="" ma:contentTypeName="Document" ma:contentTypeID="0x010100D77CEC38673E984C9A71D5BC8B61A7A2" ma:contentTypeVersion="4" ma:contentTypeDescription="Create a new document." ma:contentTypeScope="" ma:versionID="7e34a3fbd6f5c28bb9bfa31a595c0d70">
   <xsd:schema xmlns:xsd="http://www.w3.org/2001/XMLSchema" xmlns:xs="http://www.w3.org/2001/XMLSchema" xmlns:p="http://schemas.microsoft.com/office/2006/metadata/properties" xmlns:ns2="54ec9838-0981-4e83-ac84-7c1f162306e1" targetNamespace="http://schemas.microsoft.com/office/2006/metadata/properties" ma:root="true" ma:fieldsID="b8acb01bf7432364e3c06e02e4bb86ec" ns2:_="">
     <xsd:import namespace="54ec9838-0981-4e83-ac84-7c1f162306e1"/>
@@ -8741,33 +9044,25 @@
 </ct:contentTypeSchema>
 </file>
 
+<file path=customXml/item3.xml><?xml version="1.0" encoding="utf-8"?>
+<p:properties xmlns:p="http://schemas.microsoft.com/office/2006/metadata/properties" xmlns:xsi="http://www.w3.org/2001/XMLSchema-instance" xmlns:pc="http://schemas.microsoft.com/office/infopath/2007/PartnerControls">
+  <documentManagement/>
+</p:properties>
+</file>
+
 <file path=customXml/item4.xml><?xml version="1.0" encoding="utf-8"?>
-<?mso-contentType ?>
-<FormTemplates xmlns="http://schemas.microsoft.com/sharepoint/v3/contenttype/forms">
-  <Display>DocumentLibraryForm</Display>
-  <Edit>DocumentLibraryForm</Edit>
-  <New>DocumentLibraryForm</New>
-</FormTemplates>
+<b:Sources xmlns:b="http://schemas.openxmlformats.org/officeDocument/2006/bibliography" xmlns="http://schemas.openxmlformats.org/officeDocument/2006/bibliography" SelectedStyle="/APASixthEditionOfficeOnline.xsl" StyleName="APA" Version="6"/>
 </file>
 
 <file path=customXml/itemProps1.xml><?xml version="1.0" encoding="utf-8"?>
-<ds:datastoreItem xmlns:ds="http://schemas.openxmlformats.org/officeDocument/2006/customXml" ds:itemID="{3FF91D6D-BC62-ED47-9031-2194236716E2}">
+<ds:datastoreItem xmlns:ds="http://schemas.openxmlformats.org/officeDocument/2006/customXml" ds:itemID="{0091FDAA-5EB3-4346-9FDD-D0EF29E978A0}">
   <ds:schemaRefs>
-    <ds:schemaRef ds:uri="http://schemas.openxmlformats.org/officeDocument/2006/bibliography"/>
+    <ds:schemaRef ds:uri="http://schemas.microsoft.com/sharepoint/v3/contenttype/forms"/>
   </ds:schemaRefs>
 </ds:datastoreItem>
 </file>
 
 <file path=customXml/itemProps2.xml><?xml version="1.0" encoding="utf-8"?>
-<ds:datastoreItem xmlns:ds="http://schemas.openxmlformats.org/officeDocument/2006/customXml" ds:itemID="{242CD333-29DE-460F-8103-5AC32B5353BA}">
-  <ds:schemaRefs>
-    <ds:schemaRef ds:uri="http://schemas.microsoft.com/office/2006/metadata/properties"/>
-    <ds:schemaRef ds:uri="http://schemas.microsoft.com/office/infopath/2007/PartnerControls"/>
-  </ds:schemaRefs>
-</ds:datastoreItem>
-</file>
-
-<file path=customXml/itemProps3.xml><?xml version="1.0" encoding="utf-8"?>
 <ds:datastoreItem xmlns:ds="http://schemas.openxmlformats.org/officeDocument/2006/customXml" ds:itemID="{F3196CE4-EB73-47B0-ACB8-24B41669AA72}">
   <ds:schemaRefs>
     <ds:schemaRef ds:uri="http://schemas.microsoft.com/office/2006/metadata/contentType"/>
@@ -8785,10 +9080,19 @@
 </ds:datastoreItem>
 </file>
 
+<file path=customXml/itemProps3.xml><?xml version="1.0" encoding="utf-8"?>
+<ds:datastoreItem xmlns:ds="http://schemas.openxmlformats.org/officeDocument/2006/customXml" ds:itemID="{242CD333-29DE-460F-8103-5AC32B5353BA}">
+  <ds:schemaRefs>
+    <ds:schemaRef ds:uri="http://schemas.microsoft.com/office/2006/metadata/properties"/>
+    <ds:schemaRef ds:uri="http://schemas.microsoft.com/office/infopath/2007/PartnerControls"/>
+  </ds:schemaRefs>
+</ds:datastoreItem>
+</file>
+
 <file path=customXml/itemProps4.xml><?xml version="1.0" encoding="utf-8"?>
-<ds:datastoreItem xmlns:ds="http://schemas.openxmlformats.org/officeDocument/2006/customXml" ds:itemID="{0091FDAA-5EB3-4346-9FDD-D0EF29E978A0}">
+<ds:datastoreItem xmlns:ds="http://schemas.openxmlformats.org/officeDocument/2006/customXml" ds:itemID="{3FF91D6D-BC62-ED47-9031-2194236716E2}">
   <ds:schemaRefs>
-    <ds:schemaRef ds:uri="http://schemas.microsoft.com/sharepoint/v3/contenttype/forms"/>
+    <ds:schemaRef ds:uri="http://schemas.openxmlformats.org/officeDocument/2006/bibliography"/>
   </ds:schemaRefs>
 </ds:datastoreItem>
 </file>
</xml_diff>